<commit_message>
Alinha o serviço ao horário de funcionamento e cria o dia de substituição
A redação anterior negava qualquer referência de horário, o que não
corresponde à operação: o serviço acompanha o funcionamento do
empreendimento e há um dia por semana com troca de pessoa.

- Cláusula 2.2: cobertura devida todos os dias, com a organização da
  equipe a cargo da Contratada.
- Nova Cláusula 2.4: um dia por semana o atendimento é coberto por
  substituto indicado pela Contratada, informado com antecedência e
  ajustado de comum acordo à ocupação prevista.
- Cláusula 4.2: a autonomia passa a ser exercida dentro do horário de
  funcionamento, que é referência de tempo do serviço e decorre da
  natureza da atividade hoteleira.
- Cláusula 4.3: a Contratante indica horário de funcionamento e demanda
  do dia, não o horário pessoal de cada pessoa.

Co-Authored-By: Claude Opus 5 <noreply@anthropic.com>
Claude-Session: https://claude.ai/code/session_01JvuJwy7yY4EnoYMkQynCaG
</commit_message>
<xml_diff>
--- a/docs/juridico/acordo-servicos-hoteleiros.docx
+++ b/docs/juridico/acordo-servicos-hoteleiros.docx
@@ -385,7 +385,19 @@
         <w:rPr>
           <w:b w:val="0"/>
         </w:rPr>
-        <w:t>, e não jornada de ninguém. Cabe à CONTRATADA organizar quem cobre cada momento, o revezamento, os intervalos, as folgas e as substituições, podendo alterar isso quando quiser.</w:t>
+        <w:t xml:space="preserve"> e a referência de tempo do serviço contratado — não é jornada de ninguém. A cobertura é devida </w:t>
+      </w:r>
+      <w:r>
+        <w:rPr>
+          <w:b/>
+        </w:rPr>
+        <w:t>todos os dias</w:t>
+      </w:r>
+      <w:r>
+        <w:rPr>
+          <w:b w:val="0"/>
+        </w:rPr>
+        <w:t>, e cabe à CONTRATADA organizar quem cobre cada momento, o revezamento, as pausas e as substituições da sua equipe.</w:t>
       </w:r>
     </w:p>
     <w:p>
@@ -431,7 +443,45 @@
         <w:rPr>
           <w:b/>
         </w:rPr>
-        <w:t>2.4.</w:t>
+        <w:t>2.4. Dia de substituição.</w:t>
+      </w:r>
+      <w:r>
+        <w:rPr>
+          <w:b w:val="0"/>
+        </w:rPr>
+        <w:t xml:space="preserve"> Um dia por semana o atendimento é coberto por </w:t>
+      </w:r>
+      <w:r>
+        <w:rPr>
+          <w:b/>
+        </w:rPr>
+        <w:t>pessoa substituta</w:t>
+      </w:r>
+      <w:r>
+        <w:rPr>
+          <w:b w:val="0"/>
+        </w:rPr>
+        <w:t xml:space="preserve"> indicada pela CONTRATADA, mantida a mesma qualidade. A CONTRATADA informa com antecedência qual será esse dia, e as Partes o </w:t>
+      </w:r>
+      <w:r>
+        <w:rPr>
+          <w:b/>
+        </w:rPr>
+        <w:t>ajustam de comum acordo</w:t>
+      </w:r>
+      <w:r>
+        <w:rPr>
+          <w:b w:val="0"/>
+        </w:rPr>
+        <w:t xml:space="preserve"> à ocupação prevista e à demanda do empreendimento, de modo que a operação não fique descoberta. A escolha de quem substitui é da CONTRATADA.</w:t>
+      </w:r>
+    </w:p>
+    <w:p>
+      <w:r>
+        <w:rPr>
+          <w:b/>
+        </w:rPr>
+        <w:t>2.5.</w:t>
       </w:r>
       <w:r>
         <w:rPr>
@@ -637,19 +687,19 @@
         <w:rPr>
           <w:b w:val="0"/>
         </w:rPr>
-        <w:t xml:space="preserve"> A CONTRATADA organiza seu trabalho com autonomia, </w:t>
+        <w:t xml:space="preserve"> Os serviços são prestados dentro do </w:t>
       </w:r>
       <w:r>
         <w:rPr>
           <w:b/>
         </w:rPr>
-        <w:t>sem dia ou horário fixo para qualquer pessoa</w:t>
+        <w:t>horário de funcionamento do empreendimento</w:t>
       </w:r>
       <w:r>
         <w:rPr>
           <w:b w:val="0"/>
         </w:rPr>
-        <w:t>, pode se fazer substituir quando quiser, é livre para atender outros clientes e assume os custos e os riscos da própria atividade.</w:t>
+        <w:t xml:space="preserve"> (Cláusula 2.1), que é a referência de tempo do que foi contratado e decorre da natureza da atividade hoteleira. Dentro dele, a CONTRATADA organiza a própria equipe com autonomia — quem cobre cada período, o revezamento, as pausas, as substituições e o dia de substituição da Cláusula 2.4 —, pode se fazer substituir quando quiser, é livre para atender outros clientes e assume os custos e os riscos da própria atividade.</w:t>
       </w:r>
     </w:p>
     <w:p>
@@ -663,7 +713,19 @@
         <w:rPr>
           <w:b w:val="0"/>
         </w:rPr>
-        <w:t xml:space="preserve"> A CONTRATANTE não fixa horário pessoal de ninguém, não exige a presença da titular, não controla frequência e não concede a pessoas da equipe pagamento, adiantamento, empréstimo ou benefício — tudo é pago à empresa, contra documento.</w:t>
+        <w:t xml:space="preserve"> A CONTRATANTE indica o </w:t>
+      </w:r>
+      <w:r>
+        <w:rPr>
+          <w:b/>
+        </w:rPr>
+        <w:t>horário de funcionamento e a demanda do dia</w:t>
+      </w:r>
+      <w:r>
+        <w:rPr>
+          <w:b w:val="0"/>
+        </w:rPr>
+        <w:t>, e não o horário pessoal de cada pessoa: não exige a presença da titular, não registra frequência, não controla entrada, saída ou pausas de ninguém, e não concede a pessoas da equipe pagamento, adiantamento, empréstimo ou benefício — tudo é pago à empresa, contra documento.</w:t>
       </w:r>
     </w:p>
     <w:p>

</xml_diff>